<commit_message>
docs: Correção de sumário
</commit_message>
<xml_diff>
--- a/vizin/docs/Documentation_Vizin.docx
+++ b/vizin/docs/Documentation_Vizin.docx
@@ -43,12 +43,12 @@
           <wp:inline distB="0" distT="0" distL="0" distR="0">
             <wp:extent cx="1531620" cy="624738"/>
             <wp:effectExtent b="0" l="0" r="0" t="0"/>
-            <wp:docPr id="1" name="image1.jpg"/>
+            <wp:docPr id="1" name="image2.jpg"/>
             <a:graphic>
               <a:graphicData uri="http://schemas.openxmlformats.org/drawingml/2006/picture">
                 <pic:pic>
                   <pic:nvPicPr>
-                    <pic:cNvPr id="0" name="image1.jpg"/>
+                    <pic:cNvPr id="0" name="image2.jpg"/>
                     <pic:cNvPicPr preferRelativeResize="0"/>
                   </pic:nvPicPr>
                   <pic:blipFill>
@@ -1278,7 +1278,7 @@
     </w:p>
     <w:sdt>
       <w:sdtPr>
-        <w:id w:val="85023086"/>
+        <w:id w:val="156008990"/>
         <w:docPartObj>
           <w:docPartGallery w:val="Table of Contents"/>
           <w:docPartUnique w:val="1"/>
@@ -2613,7 +2613,35 @@
                 <w:vertAlign w:val="baseline"/>
                 <w:rtl w:val="0"/>
               </w:rPr>
-              <w:t xml:space="preserve">UC01 - Analisar Performance de Acidentes por Rodovia</w:t>
+              <w:t xml:space="preserve">UC01 -</w:t>
+            </w:r>
+          </w:hyperlink>
+          <w:hyperlink w:anchor="_701pooc6ew36">
+            <w:r>
+              <w:rPr>
+                <w:rtl w:val="0"/>
+              </w:rPr>
+              <w:t xml:space="preserve"> Cadastro padrão de administrador</w:t>
+            </w:r>
+          </w:hyperlink>
+          <w:hyperlink w:anchor="_701pooc6ew36">
+            <w:r>
+              <w:rPr>
+                <w:rFonts w:ascii="Arial" w:cs="Arial" w:eastAsia="Arial" w:hAnsi="Arial"/>
+                <w:b w:val="0"/>
+                <w:bCs w:val="0"/>
+                <w:i w:val="0"/>
+                <w:iCs w:val="0"/>
+                <w:smallCaps w:val="0"/>
+                <w:strike w:val="0"/>
+                <w:color w:val="000000"/>
+                <w:sz w:val="24"/>
+                <w:szCs w:val="24"/>
+                <w:u w:val="none"/>
+                <w:shd w:fill="auto" w:val="clear"/>
+                <w:vertAlign w:val="baseline"/>
+                <w:rtl w:val="0"/>
+              </w:rPr>
               <w:tab/>
               <w:t xml:space="preserve">18</w:t>
             </w:r>
@@ -2678,11 +2706,24 @@
                 <w:vertAlign w:val="baseline"/>
                 <w:rtl w:val="0"/>
               </w:rPr>
-              <w:t xml:space="preserve">UC02 - Identificar Sazonalidade e Horários de Risco</w:t>
+              <w:t xml:space="preserve">UC02 - Login de administrador via Google</w:t>
               <w:tab/>
-              <w:t xml:space="preserve">18</w:t>
             </w:r>
           </w:hyperlink>
+          <w:r>
+            <w:fldChar w:fldCharType="begin"/>
+            <w:instrText xml:space="preserve"> PAGEREF _ypa52jd1ibpu \h </w:instrText>
+            <w:fldChar w:fldCharType="separate"/>
+          </w:r>
+          <w:r>
+            <w:rPr>
+              <w:rtl w:val="0"/>
+            </w:rPr>
+            <w:t xml:space="preserve">19</w:t>
+          </w:r>
+          <w:r>
+            <w:fldChar w:fldCharType="end"/>
+          </w:r>
           <w:r>
             <w:rPr>
               <w:rtl w:val="0"/>
@@ -2743,7 +2784,35 @@
                 <w:vertAlign w:val="baseline"/>
                 <w:rtl w:val="0"/>
               </w:rPr>
-              <w:t xml:space="preserve">UC03  Analisar Causas e Condições dos Acidentes</w:t>
+              <w:t xml:space="preserve">UC03 </w:t>
+            </w:r>
+          </w:hyperlink>
+          <w:hyperlink w:anchor="_ypa52jd1ibpu">
+            <w:r>
+              <w:rPr>
+                <w:rtl w:val="0"/>
+              </w:rPr>
+              <w:t xml:space="preserve">- Cadastro de funcionários</w:t>
+            </w:r>
+          </w:hyperlink>
+          <w:hyperlink w:anchor="_ypa52jd1ibpu">
+            <w:r>
+              <w:rPr>
+                <w:rFonts w:ascii="Arial" w:cs="Arial" w:eastAsia="Arial" w:hAnsi="Arial"/>
+                <w:b w:val="0"/>
+                <w:bCs w:val="0"/>
+                <w:i w:val="0"/>
+                <w:iCs w:val="0"/>
+                <w:smallCaps w:val="0"/>
+                <w:strike w:val="0"/>
+                <w:color w:val="000000"/>
+                <w:sz w:val="24"/>
+                <w:szCs w:val="24"/>
+                <w:u w:val="none"/>
+                <w:shd w:fill="auto" w:val="clear"/>
+                <w:vertAlign w:val="baseline"/>
+                <w:rtl w:val="0"/>
+              </w:rPr>
               <w:tab/>
               <w:t xml:space="preserve">19</w:t>
             </w:r>
@@ -2808,11 +2877,52 @@
                 <w:vertAlign w:val="baseline"/>
                 <w:rtl w:val="0"/>
               </w:rPr>
-              <w:t xml:space="preserve">UC04 — Monitorar Evolução Histórica de Acidentes</w:t>
+              <w:t xml:space="preserve">UC04 </w:t>
+            </w:r>
+          </w:hyperlink>
+          <w:hyperlink w:anchor="_5cozlm1nfb8q">
+            <w:r>
+              <w:rPr>
+                <w:rtl w:val="0"/>
+              </w:rPr>
+              <w:t xml:space="preserve">- Registro de encomenda</w:t>
+            </w:r>
+          </w:hyperlink>
+          <w:hyperlink w:anchor="_5cozlm1nfb8q">
+            <w:r>
+              <w:rPr>
+                <w:rFonts w:ascii="Arial" w:cs="Arial" w:eastAsia="Arial" w:hAnsi="Arial"/>
+                <w:b w:val="0"/>
+                <w:bCs w:val="0"/>
+                <w:i w:val="0"/>
+                <w:iCs w:val="0"/>
+                <w:smallCaps w:val="0"/>
+                <w:strike w:val="0"/>
+                <w:color w:val="000000"/>
+                <w:sz w:val="24"/>
+                <w:szCs w:val="24"/>
+                <w:u w:val="none"/>
+                <w:shd w:fill="auto" w:val="clear"/>
+                <w:vertAlign w:val="baseline"/>
+                <w:rtl w:val="0"/>
+              </w:rPr>
               <w:tab/>
-              <w:t xml:space="preserve">19</w:t>
             </w:r>
           </w:hyperlink>
+          <w:r>
+            <w:fldChar w:fldCharType="begin"/>
+            <w:instrText xml:space="preserve"> PAGEREF _8u2fszm93xdn \h </w:instrText>
+            <w:fldChar w:fldCharType="separate"/>
+          </w:r>
+          <w:r>
+            <w:rPr>
+              <w:rtl w:val="0"/>
+            </w:rPr>
+            <w:t xml:space="preserve">20</w:t>
+          </w:r>
+          <w:r>
+            <w:fldChar w:fldCharType="end"/>
+          </w:r>
           <w:r>
             <w:rPr>
               <w:rtl w:val="0"/>
@@ -7095,12 +7205,12 @@
           <wp:inline distB="0" distT="0" distL="0" distR="0">
             <wp:extent cx="5181600" cy="3067050"/>
             <wp:effectExtent b="0" l="0" r="0" t="0"/>
-            <wp:docPr descr="MoSCoW&#10;&#10;Legenda de priorização MoSCoW" id="3" name="image3.jpg"/>
+            <wp:docPr descr="MoSCoW&#10;&#10;Legenda de priorização MoSCoW" id="3" name="image1.jpg"/>
             <a:graphic>
               <a:graphicData uri="http://schemas.openxmlformats.org/drawingml/2006/picture">
                 <pic:pic>
                   <pic:nvPicPr>
-                    <pic:cNvPr descr="MoSCoW&#10;&#10;Legenda de priorização MoSCoW" id="0" name="image3.jpg"/>
+                    <pic:cNvPr descr="MoSCoW&#10;&#10;Legenda de priorização MoSCoW" id="0" name="image1.jpg"/>
                     <pic:cNvPicPr preferRelativeResize="0"/>
                   </pic:nvPicPr>
                   <pic:blipFill>
@@ -11396,29 +11506,34 @@
         </w:rPr>
         <w:t xml:space="preserve"> </w:t>
       </w:r>
-      <w:r>
-        <w:br w:type="page"/>
-      </w:r>
-      <w:r>
-        <w:rPr>
-          <w:rtl w:val="0"/>
-        </w:rPr>
-      </w:r>
-    </w:p>
-    <w:p>
-      <w:pPr>
-        <w:pStyle w:val="Heading1"/>
-        <w:spacing w:after="0" w:line="360" w:lineRule="auto"/>
-        <w:ind w:left="0" w:right="0" w:firstLine="709"/>
-        <w:rPr/>
-      </w:pPr>
-      <w:bookmarkStart w:colFirst="0" w:colLast="0" w:name="_9n7ajorxsqau" w:id="14"/>
-      <w:bookmarkEnd w:id="14"/>
-      <w:r>
-        <w:rPr>
-          <w:rtl w:val="0"/>
-        </w:rPr>
-        <w:t xml:space="preserve">6. CASOS DE USO </w:t>
+    </w:p>
+    <w:p>
+      <w:pPr>
+        <w:rPr/>
+      </w:pPr>
+      <w:r>
+        <w:rPr>
+          <w:rtl w:val="0"/>
+        </w:rPr>
+      </w:r>
+    </w:p>
+    <w:p>
+      <w:pPr>
+        <w:rPr/>
+      </w:pPr>
+      <w:r>
+        <w:rPr>
+          <w:b w:val="1"/>
+          <w:bCs w:val="1"/>
+          <w:rtl w:val="0"/>
+        </w:rPr>
+        <w:t xml:space="preserve">6. CASOS DE USO</w:t>
+      </w:r>
+      <w:r>
+        <w:rPr>
+          <w:rtl w:val="0"/>
+        </w:rPr>
+        <w:t xml:space="preserve"> </w:t>
       </w:r>
     </w:p>
     <w:p>
@@ -11460,8 +11575,8 @@
         <w:spacing w:before="0" w:line="360" w:lineRule="auto"/>
         <w:rPr/>
       </w:pPr>
-      <w:bookmarkStart w:colFirst="0" w:colLast="0" w:name="_701pooc6ew36" w:id="15"/>
-      <w:bookmarkEnd w:id="15"/>
+      <w:bookmarkStart w:colFirst="0" w:colLast="0" w:name="_701pooc6ew36" w:id="14"/>
+      <w:bookmarkEnd w:id="14"/>
       <w:r>
         <w:rPr>
           <w:rtl w:val="0"/>
@@ -11814,8 +11929,8 @@
         <w:spacing w:before="0" w:line="360" w:lineRule="auto"/>
         <w:rPr/>
       </w:pPr>
-      <w:bookmarkStart w:colFirst="0" w:colLast="0" w:name="_b51wy85crl9d" w:id="16"/>
-      <w:bookmarkEnd w:id="16"/>
+      <w:bookmarkStart w:colFirst="0" w:colLast="0" w:name="_b51wy85crl9d" w:id="15"/>
+      <w:bookmarkEnd w:id="15"/>
       <w:r>
         <w:rPr>
           <w:rtl w:val="0"/>
@@ -12167,8 +12282,8 @@
         <w:spacing w:before="0" w:line="360" w:lineRule="auto"/>
         <w:rPr/>
       </w:pPr>
-      <w:bookmarkStart w:colFirst="0" w:colLast="0" w:name="_mwerlcpqaqgp" w:id="17"/>
-      <w:bookmarkEnd w:id="17"/>
+      <w:bookmarkStart w:colFirst="0" w:colLast="0" w:name="_mwerlcpqaqgp" w:id="16"/>
+      <w:bookmarkEnd w:id="16"/>
       <w:r>
         <w:rPr>
           <w:rtl w:val="0"/>
@@ -12520,8 +12635,8 @@
         <w:spacing w:before="0" w:line="360" w:lineRule="auto"/>
         <w:rPr/>
       </w:pPr>
-      <w:bookmarkStart w:colFirst="0" w:colLast="0" w:name="_m756n3bzxait" w:id="18"/>
-      <w:bookmarkEnd w:id="18"/>
+      <w:bookmarkStart w:colFirst="0" w:colLast="0" w:name="_m756n3bzxait" w:id="17"/>
+      <w:bookmarkEnd w:id="17"/>
       <w:r>
         <w:rPr>
           <w:rtl w:val="0"/>
@@ -12900,8 +13015,8 @@
         <w:pStyle w:val="Heading3"/>
         <w:rPr/>
       </w:pPr>
-      <w:bookmarkStart w:colFirst="0" w:colLast="0" w:name="_8u2fszm93xdn" w:id="19"/>
-      <w:bookmarkEnd w:id="19"/>
+      <w:bookmarkStart w:colFirst="0" w:colLast="0" w:name="_8u2fszm93xdn" w:id="18"/>
+      <w:bookmarkEnd w:id="18"/>
       <w:r>
         <w:rPr>
           <w:rtl w:val="0"/>
@@ -12932,8 +13047,8 @@
         <w:pStyle w:val="Heading3"/>
         <w:rPr/>
       </w:pPr>
-      <w:bookmarkStart w:colFirst="0" w:colLast="0" w:name="_7k8qbak80fxe" w:id="20"/>
-      <w:bookmarkEnd w:id="20"/>
+      <w:bookmarkStart w:colFirst="0" w:colLast="0" w:name="_7k8qbak80fxe" w:id="19"/>
+      <w:bookmarkEnd w:id="19"/>
       <w:r>
         <w:rPr>
           <w:rtl w:val="0"/>
@@ -13071,12 +13186,12 @@
           <wp:inline distB="0" distT="0" distL="0" distR="0">
             <wp:extent cx="4881268" cy="6508356"/>
             <wp:effectExtent b="0" l="0" r="0" t="0"/>
-            <wp:docPr id="2" name="image4.png"/>
+            <wp:docPr id="2" name="image5.png"/>
             <a:graphic>
               <a:graphicData uri="http://schemas.openxmlformats.org/drawingml/2006/picture">
                 <pic:pic>
                   <pic:nvPicPr>
-                    <pic:cNvPr id="0" name="image4.png"/>
+                    <pic:cNvPr id="0" name="image5.png"/>
                     <pic:cNvPicPr preferRelativeResize="0"/>
                   </pic:nvPicPr>
                   <pic:blipFill>
@@ -13168,8 +13283,8 @@
           <w:iCs w:val="0"/>
         </w:rPr>
       </w:pPr>
-      <w:bookmarkStart w:colFirst="0" w:colLast="0" w:name="_h8riabrl1t1r" w:id="21"/>
-      <w:bookmarkEnd w:id="21"/>
+      <w:bookmarkStart w:colFirst="0" w:colLast="0" w:name="_h8riabrl1t1r" w:id="20"/>
+      <w:bookmarkEnd w:id="20"/>
       <w:r>
         <w:rPr>
           <w:i w:val="0"/>
@@ -13202,12 +13317,12 @@
           <wp:inline distB="0" distT="0" distL="0" distR="0">
             <wp:extent cx="5051637" cy="4421952"/>
             <wp:effectExtent b="0" l="0" r="0" t="0"/>
-            <wp:docPr id="5" name="image5.png"/>
+            <wp:docPr id="5" name="image4.png"/>
             <a:graphic>
               <a:graphicData uri="http://schemas.openxmlformats.org/drawingml/2006/picture">
                 <pic:pic>
                   <pic:nvPicPr>
-                    <pic:cNvPr id="0" name="image5.png"/>
+                    <pic:cNvPr id="0" name="image4.png"/>
                     <pic:cNvPicPr preferRelativeResize="0"/>
                   </pic:nvPicPr>
                   <pic:blipFill>
@@ -13292,8 +13407,8 @@
         <w:pStyle w:val="Heading3"/>
         <w:rPr/>
       </w:pPr>
-      <w:bookmarkStart w:colFirst="0" w:colLast="0" w:name="_3agnx0gkgjmx" w:id="22"/>
-      <w:bookmarkEnd w:id="22"/>
+      <w:bookmarkStart w:colFirst="0" w:colLast="0" w:name="_3agnx0gkgjmx" w:id="21"/>
+      <w:bookmarkEnd w:id="21"/>
       <w:r>
         <w:rPr>
           <w:rtl w:val="0"/>
@@ -13355,12 +13470,12 @@
           <wp:inline distB="0" distT="0" distL="0" distR="0">
             <wp:extent cx="5240655" cy="4735830"/>
             <wp:effectExtent b="0" l="0" r="0" t="0"/>
-            <wp:docPr id="4" name="image2.png"/>
+            <wp:docPr id="4" name="image3.png"/>
             <a:graphic>
               <a:graphicData uri="http://schemas.openxmlformats.org/drawingml/2006/picture">
                 <pic:pic>
                   <pic:nvPicPr>
-                    <pic:cNvPr id="0" name="image2.png"/>
+                    <pic:cNvPr id="0" name="image3.png"/>
                     <pic:cNvPicPr preferRelativeResize="0"/>
                   </pic:nvPicPr>
                   <pic:blipFill>
@@ -13445,8 +13560,8 @@
         <w:pStyle w:val="Heading3"/>
         <w:rPr/>
       </w:pPr>
-      <w:bookmarkStart w:colFirst="0" w:colLast="0" w:name="_8u4thez7numd" w:id="23"/>
-      <w:bookmarkEnd w:id="23"/>
+      <w:bookmarkStart w:colFirst="0" w:colLast="0" w:name="_8u4thez7numd" w:id="22"/>
+      <w:bookmarkEnd w:id="22"/>
       <w:r>
         <w:rPr>
           <w:rtl w:val="0"/>
@@ -14212,8 +14327,8 @@
         <w:pStyle w:val="Heading3"/>
         <w:rPr/>
       </w:pPr>
-      <w:bookmarkStart w:colFirst="0" w:colLast="0" w:name="_63mtd0t8j7m" w:id="24"/>
-      <w:bookmarkEnd w:id="24"/>
+      <w:bookmarkStart w:colFirst="0" w:colLast="0" w:name="_63mtd0t8j7m" w:id="23"/>
+      <w:bookmarkEnd w:id="23"/>
       <w:r>
         <w:rPr>
           <w:rtl w:val="0"/>
@@ -14274,8 +14389,8 @@
               <w:jc w:val="center"/>
               <w:rPr/>
             </w:pPr>
-            <w:bookmarkStart w:colFirst="0" w:colLast="0" w:name="_y4bqbcjzqdle" w:id="25"/>
-            <w:bookmarkEnd w:id="25"/>
+            <w:bookmarkStart w:colFirst="0" w:colLast="0" w:name="_y4bqbcjzqdle" w:id="24"/>
+            <w:bookmarkEnd w:id="24"/>
             <w:r>
               <w:rPr>
                 <w:rtl w:val="0"/>
@@ -14301,8 +14416,8 @@
               <w:jc w:val="center"/>
               <w:rPr/>
             </w:pPr>
-            <w:bookmarkStart w:colFirst="0" w:colLast="0" w:name="_8n582ur9ovpa" w:id="26"/>
-            <w:bookmarkEnd w:id="26"/>
+            <w:bookmarkStart w:colFirst="0" w:colLast="0" w:name="_8n582ur9ovpa" w:id="25"/>
+            <w:bookmarkEnd w:id="25"/>
             <w:r>
               <w:rPr>
                 <w:rtl w:val="0"/>
@@ -14327,8 +14442,8 @@
               <w:jc w:val="center"/>
               <w:rPr/>
             </w:pPr>
-            <w:bookmarkStart w:colFirst="0" w:colLast="0" w:name="_376etxn8vop7" w:id="27"/>
-            <w:bookmarkEnd w:id="27"/>
+            <w:bookmarkStart w:colFirst="0" w:colLast="0" w:name="_376etxn8vop7" w:id="26"/>
+            <w:bookmarkEnd w:id="26"/>
             <w:r>
               <w:rPr>
                 <w:rtl w:val="0"/>
@@ -14928,8 +15043,8 @@
         <w:pStyle w:val="Heading3"/>
         <w:rPr/>
       </w:pPr>
-      <w:bookmarkStart w:colFirst="0" w:colLast="0" w:name="_fo3cotjhbwx5" w:id="28"/>
-      <w:bookmarkEnd w:id="28"/>
+      <w:bookmarkStart w:colFirst="0" w:colLast="0" w:name="_fo3cotjhbwx5" w:id="27"/>
+      <w:bookmarkEnd w:id="27"/>
       <w:r>
         <w:rPr>
           <w:rtl w:val="0"/>
@@ -16497,8 +16612,8 @@
         <w:ind w:left="0" w:right="0" w:firstLine="709"/>
         <w:rPr/>
       </w:pPr>
-      <w:bookmarkStart w:colFirst="0" w:colLast="0" w:name="_12xduhaj1dgs" w:id="29"/>
-      <w:bookmarkEnd w:id="29"/>
+      <w:bookmarkStart w:colFirst="0" w:colLast="0" w:name="_12xduhaj1dgs" w:id="28"/>
+      <w:bookmarkEnd w:id="28"/>
       <w:r>
         <w:rPr>
           <w:rtl w:val="0"/>
@@ -16589,8 +16704,8 @@
         <w:ind w:left="0" w:right="0" w:firstLine="709"/>
         <w:rPr/>
       </w:pPr>
-      <w:bookmarkStart w:colFirst="0" w:colLast="0" w:name="_ssjh1c5hkn68" w:id="30"/>
-      <w:bookmarkEnd w:id="30"/>
+      <w:bookmarkStart w:colFirst="0" w:colLast="0" w:name="_ssjh1c5hkn68" w:id="29"/>
+      <w:bookmarkEnd w:id="29"/>
       <w:r>
         <w:rPr>
           <w:rtl w:val="0"/>
@@ -17303,296 +17418,296 @@
         <w:ind w:left="0" w:right="0" w:firstLine="709"/>
         <w:rPr/>
       </w:pPr>
-      <w:bookmarkStart w:colFirst="0" w:colLast="0" w:name="_d2qb1isq84j" w:id="31"/>
+      <w:bookmarkStart w:colFirst="0" w:colLast="0" w:name="_d2qb1isq84j" w:id="30"/>
+      <w:bookmarkEnd w:id="30"/>
+      <w:r>
+        <w:rPr>
+          <w:rtl w:val="0"/>
+        </w:rPr>
+        <w:t xml:space="preserve">REFERÊNCIAS </w:t>
+      </w:r>
+    </w:p>
+    <w:p>
+      <w:pPr>
+        <w:rPr/>
+      </w:pPr>
+      <w:r>
+        <w:rPr>
+          <w:rtl w:val="0"/>
+        </w:rPr>
+      </w:r>
+    </w:p>
+    <w:p>
+      <w:pPr>
+        <w:ind w:firstLine="0"/>
+        <w:rPr/>
+      </w:pPr>
+      <w:r>
+        <w:rPr>
+          <w:rtl w:val="0"/>
+        </w:rPr>
+        <w:t xml:space="preserve">ALBINO, Igor Caceres. Dominando CSS. São Paulo: Casa do Código, 2015.</w:t>
+      </w:r>
+    </w:p>
+    <w:p>
+      <w:pPr>
+        <w:ind w:firstLine="0"/>
+        <w:rPr/>
+      </w:pPr>
+      <w:r>
+        <w:rPr>
+          <w:rtl w:val="0"/>
+        </w:rPr>
+      </w:r>
+    </w:p>
+    <w:p>
+      <w:pPr>
+        <w:ind w:firstLine="0"/>
+        <w:rPr/>
+      </w:pPr>
+      <w:r>
+        <w:rPr>
+          <w:rtl w:val="0"/>
+        </w:rPr>
+        <w:t xml:space="preserve">CBN RECIFE. Censo 2022 revela que 21,3% dos domicílios em Pernambuco são alugados. Disponível em: &lt;https://acervo.cbnrecife.com/artigo/censo-2022-revela-que-21-3-dos-domicilios-em-pernambuco-sao-alugados&gt;. Acesso em: 01 jun. 2026</w:t>
+      </w:r>
+    </w:p>
+    <w:p>
+      <w:pPr>
+        <w:ind w:firstLine="0"/>
+        <w:rPr/>
+      </w:pPr>
+      <w:r>
+        <w:rPr>
+          <w:rtl w:val="0"/>
+        </w:rPr>
+      </w:r>
+    </w:p>
+    <w:p>
+      <w:pPr>
+        <w:ind w:firstLine="0"/>
+        <w:rPr/>
+      </w:pPr>
+      <w:r>
+        <w:rPr>
+          <w:rtl w:val="0"/>
+        </w:rPr>
+        <w:t xml:space="preserve">CHACON, Scott; STRAUB, Ben. Pro Git. 2. ed. New York: Apress, 2014. Disponível em: &lt;https://git-scm.com/book&gt;. Acesso em: 07 jun. 2026.</w:t>
+      </w:r>
+    </w:p>
+    <w:p>
+      <w:pPr>
+        <w:ind w:firstLine="0"/>
+        <w:rPr/>
+      </w:pPr>
+      <w:r>
+        <w:rPr>
+          <w:rtl w:val="0"/>
+        </w:rPr>
+      </w:r>
+    </w:p>
+    <w:p>
+      <w:pPr>
+        <w:ind w:firstLine="0"/>
+        <w:rPr/>
+      </w:pPr>
+      <w:r>
+        <w:rPr>
+          <w:rtl w:val="0"/>
+        </w:rPr>
+        <w:t xml:space="preserve">DJANGO SOFTWARE FOUNDATION. Django Documentation. Disponível em: &lt;https://docs.djangoproject.com/&gt;. Acesso em: 07 jun. 2026.</w:t>
+      </w:r>
+    </w:p>
+    <w:p>
+      <w:pPr>
+        <w:ind w:firstLine="0"/>
+        <w:rPr/>
+      </w:pPr>
+      <w:r>
+        <w:rPr>
+          <w:rtl w:val="0"/>
+        </w:rPr>
+      </w:r>
+    </w:p>
+    <w:p>
+      <w:pPr>
+        <w:ind w:firstLine="0"/>
+        <w:rPr/>
+      </w:pPr>
+      <w:r>
+        <w:rPr>
+          <w:rtl w:val="0"/>
+        </w:rPr>
+        <w:t xml:space="preserve">GITHUB, INC. GitHub Docs. Disponível em: &lt;https://docs.github.com/&gt;. Acesso em: 07 jun. 2026.</w:t>
+      </w:r>
+    </w:p>
+    <w:p>
+      <w:pPr>
+        <w:ind w:firstLine="0"/>
+        <w:rPr/>
+      </w:pPr>
+      <w:r>
+        <w:rPr>
+          <w:rtl w:val="0"/>
+        </w:rPr>
+      </w:r>
+    </w:p>
+    <w:p>
+      <w:pPr>
+        <w:ind w:firstLine="0"/>
+        <w:rPr/>
+      </w:pPr>
+      <w:r>
+        <w:rPr>
+          <w:rtl w:val="0"/>
+        </w:rPr>
+        <w:t xml:space="preserve">INSTITUTO BRASILEIRO DE GEOGRAFIA E ESTATÍSTICA (IBGE). Censo Demográfico 2022: características dos domicílios – resultados do universo. Rio de Janeiro: IBGE, 2024. Disponível em: &lt;https://www.ibge.gov.br/biblioteca/visualizacao/periodicos/3106/cd_2022_domicilios.pdf&gt;. Acesso em: 01 jun. 2026.</w:t>
+      </w:r>
+    </w:p>
+    <w:p>
+      <w:pPr>
+        <w:ind w:firstLine="0"/>
+        <w:rPr/>
+      </w:pPr>
+      <w:r>
+        <w:rPr>
+          <w:rtl w:val="0"/>
+        </w:rPr>
+        <w:t xml:space="preserve">MOZILLA FOUNDATION. JavaScript. Disponível em: &lt;https://developer.mozilla.org/pt-BR/docs/Web/JavaScript&gt;. Acesso em: 07 jun. 2026.</w:t>
+      </w:r>
+    </w:p>
+    <w:p>
+      <w:pPr>
+        <w:ind w:firstLine="0"/>
+        <w:rPr/>
+      </w:pPr>
+      <w:r>
+        <w:rPr>
+          <w:rtl w:val="0"/>
+        </w:rPr>
+      </w:r>
+    </w:p>
+    <w:p>
+      <w:pPr>
+        <w:ind w:firstLine="0"/>
+        <w:rPr/>
+      </w:pPr>
+      <w:r>
+        <w:rPr>
+          <w:rtl w:val="0"/>
+        </w:rPr>
+        <w:t xml:space="preserve">PYTHON SOFTWARE FOUNDATION. Python Documentation. Disponível em: &lt;https://docs.python.org/3/&gt;. Acesso em: 07 jun. 2026.</w:t>
+      </w:r>
+    </w:p>
+    <w:p>
+      <w:pPr>
+        <w:ind w:firstLine="0"/>
+        <w:rPr/>
+      </w:pPr>
+      <w:r>
+        <w:rPr>
+          <w:rtl w:val="0"/>
+        </w:rPr>
+      </w:r>
+    </w:p>
+    <w:p>
+      <w:pPr>
+        <w:ind w:firstLine="0"/>
+        <w:rPr/>
+      </w:pPr>
+      <w:r>
+        <w:rPr>
+          <w:rtl w:val="0"/>
+        </w:rPr>
+        <w:t xml:space="preserve">SILVA, Maurício Samy. Criando sites com HTML: sites de alta qualidade com HTML e CSS. São Paulo: Novatec, 2008.</w:t>
+      </w:r>
+    </w:p>
+    <w:p>
+      <w:pPr>
+        <w:ind w:firstLine="0"/>
+        <w:rPr/>
+      </w:pPr>
+      <w:r>
+        <w:rPr>
+          <w:rtl w:val="0"/>
+        </w:rPr>
+      </w:r>
+    </w:p>
+    <w:p>
+      <w:pPr>
+        <w:ind w:firstLine="0"/>
+        <w:rPr/>
+      </w:pPr>
+      <w:r>
+        <w:rPr>
+          <w:rtl w:val="0"/>
+        </w:rPr>
+        <w:t xml:space="preserve">POSTGRESQL GLOBAL DEVELOPMENT GROUP. PostgreSQL 18.1 Documentation. [S.l.]: PostgreSQL Global Development Group, 2025. Disponível em: &lt;https://www.postgresql.org/files/documentation/pdf/18/postgresql-18-A4.pdf&gt;. Acesso em: 07 jun. 2026.</w:t>
+      </w:r>
+    </w:p>
+    <w:p>
+      <w:pPr>
+        <w:ind w:firstLine="0"/>
+        <w:rPr/>
+      </w:pPr>
+      <w:r>
+        <w:rPr>
+          <w:rtl w:val="0"/>
+        </w:rPr>
+      </w:r>
+    </w:p>
+    <w:p>
+      <w:pPr>
+        <w:ind w:firstLine="0"/>
+        <w:rPr/>
+      </w:pPr>
+      <w:r>
+        <w:rPr>
+          <w:rtl w:val="0"/>
+        </w:rPr>
+        <w:t xml:space="preserve">SUPABASE INC. Supabase Documentation. Disponível em: &lt;https://supabase.com/docs&gt;. Acesso em: 07 jun. 2026.</w:t>
+      </w:r>
+    </w:p>
+    <w:p>
+      <w:pPr>
+        <w:ind w:firstLine="0"/>
+        <w:rPr/>
+      </w:pPr>
+      <w:r>
+        <w:rPr>
+          <w:rtl w:val="0"/>
+        </w:rPr>
+      </w:r>
+    </w:p>
+    <w:p>
+      <w:pPr>
+        <w:ind w:firstLine="0"/>
+        <w:rPr/>
+      </w:pPr>
+      <w:r>
+        <w:rPr>
+          <w:rtl w:val="0"/>
+        </w:rPr>
+      </w:r>
+    </w:p>
+    <w:p>
+      <w:pPr>
+        <w:ind w:firstLine="0"/>
+        <w:rPr/>
+      </w:pPr>
+      <w:r>
+        <w:rPr>
+          <w:rtl w:val="0"/>
+        </w:rPr>
+      </w:r>
+    </w:p>
+    <w:p>
+      <w:pPr>
+        <w:pStyle w:val="Heading3"/>
+        <w:rPr/>
+      </w:pPr>
+      <w:bookmarkStart w:colFirst="0" w:colLast="0" w:name="_qlwd24xgzjjz" w:id="31"/>
       <w:bookmarkEnd w:id="31"/>
-      <w:r>
-        <w:rPr>
-          <w:rtl w:val="0"/>
-        </w:rPr>
-        <w:t xml:space="preserve">REFERÊNCIAS </w:t>
-      </w:r>
-    </w:p>
-    <w:p>
-      <w:pPr>
-        <w:rPr/>
-      </w:pPr>
-      <w:r>
-        <w:rPr>
-          <w:rtl w:val="0"/>
-        </w:rPr>
-      </w:r>
-    </w:p>
-    <w:p>
-      <w:pPr>
-        <w:ind w:firstLine="0"/>
-        <w:rPr/>
-      </w:pPr>
-      <w:r>
-        <w:rPr>
-          <w:rtl w:val="0"/>
-        </w:rPr>
-        <w:t xml:space="preserve">ALBINO, Igor Caceres. Dominando CSS. São Paulo: Casa do Código, 2015.</w:t>
-      </w:r>
-    </w:p>
-    <w:p>
-      <w:pPr>
-        <w:ind w:firstLine="0"/>
-        <w:rPr/>
-      </w:pPr>
-      <w:r>
-        <w:rPr>
-          <w:rtl w:val="0"/>
-        </w:rPr>
-      </w:r>
-    </w:p>
-    <w:p>
-      <w:pPr>
-        <w:ind w:firstLine="0"/>
-        <w:rPr/>
-      </w:pPr>
-      <w:r>
-        <w:rPr>
-          <w:rtl w:val="0"/>
-        </w:rPr>
-        <w:t xml:space="preserve">CBN RECIFE. Censo 2022 revela que 21,3% dos domicílios em Pernambuco são alugados. Disponível em: &lt;https://acervo.cbnrecife.com/artigo/censo-2022-revela-que-21-3-dos-domicilios-em-pernambuco-sao-alugados&gt;. Acesso em: 01 jun. 2026</w:t>
-      </w:r>
-    </w:p>
-    <w:p>
-      <w:pPr>
-        <w:ind w:firstLine="0"/>
-        <w:rPr/>
-      </w:pPr>
-      <w:r>
-        <w:rPr>
-          <w:rtl w:val="0"/>
-        </w:rPr>
-      </w:r>
-    </w:p>
-    <w:p>
-      <w:pPr>
-        <w:ind w:firstLine="0"/>
-        <w:rPr/>
-      </w:pPr>
-      <w:r>
-        <w:rPr>
-          <w:rtl w:val="0"/>
-        </w:rPr>
-        <w:t xml:space="preserve">CHACON, Scott; STRAUB, Ben. Pro Git. 2. ed. New York: Apress, 2014. Disponível em: &lt;https://git-scm.com/book&gt;. Acesso em: 07 jun. 2026.</w:t>
-      </w:r>
-    </w:p>
-    <w:p>
-      <w:pPr>
-        <w:ind w:firstLine="0"/>
-        <w:rPr/>
-      </w:pPr>
-      <w:r>
-        <w:rPr>
-          <w:rtl w:val="0"/>
-        </w:rPr>
-      </w:r>
-    </w:p>
-    <w:p>
-      <w:pPr>
-        <w:ind w:firstLine="0"/>
-        <w:rPr/>
-      </w:pPr>
-      <w:r>
-        <w:rPr>
-          <w:rtl w:val="0"/>
-        </w:rPr>
-        <w:t xml:space="preserve">DJANGO SOFTWARE FOUNDATION. Django Documentation. Disponível em: &lt;https://docs.djangoproject.com/&gt;. Acesso em: 07 jun. 2026.</w:t>
-      </w:r>
-    </w:p>
-    <w:p>
-      <w:pPr>
-        <w:ind w:firstLine="0"/>
-        <w:rPr/>
-      </w:pPr>
-      <w:r>
-        <w:rPr>
-          <w:rtl w:val="0"/>
-        </w:rPr>
-      </w:r>
-    </w:p>
-    <w:p>
-      <w:pPr>
-        <w:ind w:firstLine="0"/>
-        <w:rPr/>
-      </w:pPr>
-      <w:r>
-        <w:rPr>
-          <w:rtl w:val="0"/>
-        </w:rPr>
-        <w:t xml:space="preserve">GITHUB, INC. GitHub Docs. Disponível em: &lt;https://docs.github.com/&gt;. Acesso em: 07 jun. 2026.</w:t>
-      </w:r>
-    </w:p>
-    <w:p>
-      <w:pPr>
-        <w:ind w:firstLine="0"/>
-        <w:rPr/>
-      </w:pPr>
-      <w:r>
-        <w:rPr>
-          <w:rtl w:val="0"/>
-        </w:rPr>
-      </w:r>
-    </w:p>
-    <w:p>
-      <w:pPr>
-        <w:ind w:firstLine="0"/>
-        <w:rPr/>
-      </w:pPr>
-      <w:r>
-        <w:rPr>
-          <w:rtl w:val="0"/>
-        </w:rPr>
-        <w:t xml:space="preserve">INSTITUTO BRASILEIRO DE GEOGRAFIA E ESTATÍSTICA (IBGE). Censo Demográfico 2022: características dos domicílios – resultados do universo. Rio de Janeiro: IBGE, 2024. Disponível em: &lt;https://www.ibge.gov.br/biblioteca/visualizacao/periodicos/3106/cd_2022_domicilios.pdf&gt;. Acesso em: 01 jun. 2026.</w:t>
-      </w:r>
-    </w:p>
-    <w:p>
-      <w:pPr>
-        <w:ind w:firstLine="0"/>
-        <w:rPr/>
-      </w:pPr>
-      <w:r>
-        <w:rPr>
-          <w:rtl w:val="0"/>
-        </w:rPr>
-        <w:t xml:space="preserve">MOZILLA FOUNDATION. JavaScript. Disponível em: &lt;https://developer.mozilla.org/pt-BR/docs/Web/JavaScript&gt;. Acesso em: 07 jun. 2026.</w:t>
-      </w:r>
-    </w:p>
-    <w:p>
-      <w:pPr>
-        <w:ind w:firstLine="0"/>
-        <w:rPr/>
-      </w:pPr>
-      <w:r>
-        <w:rPr>
-          <w:rtl w:val="0"/>
-        </w:rPr>
-      </w:r>
-    </w:p>
-    <w:p>
-      <w:pPr>
-        <w:ind w:firstLine="0"/>
-        <w:rPr/>
-      </w:pPr>
-      <w:r>
-        <w:rPr>
-          <w:rtl w:val="0"/>
-        </w:rPr>
-        <w:t xml:space="preserve">PYTHON SOFTWARE FOUNDATION. Python Documentation. Disponível em: &lt;https://docs.python.org/3/&gt;. Acesso em: 07 jun. 2026.</w:t>
-      </w:r>
-    </w:p>
-    <w:p>
-      <w:pPr>
-        <w:ind w:firstLine="0"/>
-        <w:rPr/>
-      </w:pPr>
-      <w:r>
-        <w:rPr>
-          <w:rtl w:val="0"/>
-        </w:rPr>
-      </w:r>
-    </w:p>
-    <w:p>
-      <w:pPr>
-        <w:ind w:firstLine="0"/>
-        <w:rPr/>
-      </w:pPr>
-      <w:r>
-        <w:rPr>
-          <w:rtl w:val="0"/>
-        </w:rPr>
-        <w:t xml:space="preserve">SILVA, Maurício Samy. Criando sites com HTML: sites de alta qualidade com HTML e CSS. São Paulo: Novatec, 2008.</w:t>
-      </w:r>
-    </w:p>
-    <w:p>
-      <w:pPr>
-        <w:ind w:firstLine="0"/>
-        <w:rPr/>
-      </w:pPr>
-      <w:r>
-        <w:rPr>
-          <w:rtl w:val="0"/>
-        </w:rPr>
-      </w:r>
-    </w:p>
-    <w:p>
-      <w:pPr>
-        <w:ind w:firstLine="0"/>
-        <w:rPr/>
-      </w:pPr>
-      <w:r>
-        <w:rPr>
-          <w:rtl w:val="0"/>
-        </w:rPr>
-        <w:t xml:space="preserve">POSTGRESQL GLOBAL DEVELOPMENT GROUP. PostgreSQL 18.1 Documentation. [S.l.]: PostgreSQL Global Development Group, 2025. Disponível em: &lt;https://www.postgresql.org/files/documentation/pdf/18/postgresql-18-A4.pdf&gt;. Acesso em: 07 jun. 2026.</w:t>
-      </w:r>
-    </w:p>
-    <w:p>
-      <w:pPr>
-        <w:ind w:firstLine="0"/>
-        <w:rPr/>
-      </w:pPr>
-      <w:r>
-        <w:rPr>
-          <w:rtl w:val="0"/>
-        </w:rPr>
-      </w:r>
-    </w:p>
-    <w:p>
-      <w:pPr>
-        <w:ind w:firstLine="0"/>
-        <w:rPr/>
-      </w:pPr>
-      <w:r>
-        <w:rPr>
-          <w:rtl w:val="0"/>
-        </w:rPr>
-        <w:t xml:space="preserve">SUPABASE INC. Supabase Documentation. Disponível em: &lt;https://supabase.com/docs&gt;. Acesso em: 07 jun. 2026.</w:t>
-      </w:r>
-    </w:p>
-    <w:p>
-      <w:pPr>
-        <w:ind w:firstLine="0"/>
-        <w:rPr/>
-      </w:pPr>
-      <w:r>
-        <w:rPr>
-          <w:rtl w:val="0"/>
-        </w:rPr>
-      </w:r>
-    </w:p>
-    <w:p>
-      <w:pPr>
-        <w:ind w:firstLine="0"/>
-        <w:rPr/>
-      </w:pPr>
-      <w:r>
-        <w:rPr>
-          <w:rtl w:val="0"/>
-        </w:rPr>
-      </w:r>
-    </w:p>
-    <w:p>
-      <w:pPr>
-        <w:ind w:firstLine="0"/>
-        <w:rPr/>
-      </w:pPr>
-      <w:r>
-        <w:rPr>
-          <w:rtl w:val="0"/>
-        </w:rPr>
-      </w:r>
-    </w:p>
-    <w:p>
-      <w:pPr>
-        <w:pStyle w:val="Heading3"/>
-        <w:rPr/>
-      </w:pPr>
-      <w:bookmarkStart w:colFirst="0" w:colLast="0" w:name="_qlwd24xgzjjz" w:id="32"/>
-      <w:bookmarkEnd w:id="32"/>
       <w:r>
         <w:rPr>
           <w:rtl w:val="0"/>
@@ -17683,8 +17798,8 @@
         <w:pStyle w:val="Heading3"/>
         <w:rPr/>
       </w:pPr>
-      <w:bookmarkStart w:colFirst="0" w:colLast="0" w:name="_7v4qfb2f8oow" w:id="33"/>
-      <w:bookmarkEnd w:id="33"/>
+      <w:bookmarkStart w:colFirst="0" w:colLast="0" w:name="_7v4qfb2f8oow" w:id="32"/>
+      <w:bookmarkEnd w:id="32"/>
       <w:r>
         <w:rPr>
           <w:rtl w:val="0"/>

</xml_diff>